<commit_message>
committing before i make huge changes and nuke everything...
</commit_message>
<xml_diff>
--- a/JeffreyTsengResume.docx
+++ b/JeffreyTsengResume.docx
@@ -12,6 +12,28 @@
           <w:rFonts w:ascii="Times New Roman" w:hAnsi="Times New Roman"/>
           <w:sz w:val="28"/>
           <w:szCs w:val="28"/>
+        </w:rPr>
+      </w:pPr>
+    </w:p>
+    <w:p>
+      <w:pPr>
+        <w:pStyle w:val="Title"/>
+        <w:spacing w:line="200" w:lineRule="atLeast"/>
+        <w:rPr>
+          <w:rFonts w:ascii="Times New Roman" w:hAnsi="Times New Roman"/>
+          <w:sz w:val="6"/>
+          <w:szCs w:val="6"/>
+        </w:rPr>
+      </w:pPr>
+    </w:p>
+    <w:p>
+      <w:pPr>
+        <w:pStyle w:val="Title"/>
+        <w:spacing w:line="200" w:lineRule="atLeast"/>
+        <w:rPr>
+          <w:rFonts w:ascii="Times New Roman" w:hAnsi="Times New Roman"/>
+          <w:sz w:val="6"/>
+          <w:szCs w:val="6"/>
         </w:rPr>
       </w:pPr>
     </w:p>
@@ -67,7 +89,7 @@
                         <a:effectLst/>
                         <a:extLst>
                           <a:ext uri="{C572A759-6A51-4108-AA02-DFA0A04FC94B}">
-                            <ma14:wrappingTextBoxFlag xmlns="" xmlns:mo="http://schemas.microsoft.com/office/mac/office/2008/main" xmlns:mv="urn:schemas-microsoft-com:mac:vml" xmlns:o="urn:schemas-microsoft-com:office:office" xmlns:v="urn:schemas-microsoft-com:vml" xmlns:w10="urn:schemas-microsoft-com:office:word" xmlns:w="http://schemas.openxmlformats.org/wordprocessingml/2006/main" xmlns:ma14="http://schemas.microsoft.com/office/mac/drawingml/2011/main"/>
+                            <ma14:wrappingTextBoxFlag xmlns:ma14="http://schemas.microsoft.com/office/mac/drawingml/2011/main" xmlns:w="http://schemas.openxmlformats.org/wordprocessingml/2006/main" xmlns:w10="urn:schemas-microsoft-com:office:word" xmlns:v="urn:schemas-microsoft-com:vml" xmlns:o="urn:schemas-microsoft-com:office:office" xmlns:mv="urn:schemas-microsoft-com:mac:vml" xmlns:mo="http://schemas.microsoft.com/office/mac/office/2008/main" xmlns=""/>
                           </a:ext>
                         </a:extLst>
                       </wps:spPr>
@@ -392,6 +414,7 @@
           <w:b w:val="0"/>
           <w:bCs/>
           <w:sz w:val="20"/>
+          <w:szCs w:val="20"/>
         </w:rPr>
       </w:pPr>
       <w:r>
@@ -400,6 +423,7 @@
           <w:b w:val="0"/>
           <w:bCs/>
           <w:sz w:val="20"/>
+          <w:szCs w:val="20"/>
         </w:rPr>
         <w:t>First-year Computer Science and Mathematics student at Purdue with research experience in radar imaging, bioinformatics, and autonomous systems seeking a 2026 software engineering internship.</w:t>
       </w:r>
@@ -530,15 +554,6 @@
           <w:szCs w:val="20"/>
         </w:rPr>
         <w:tab/>
-      </w:r>
-      <w:r>
-        <w:rPr>
-          <w:rFonts w:eastAsiaTheme="minorHAnsi"/>
-          <w:bCs/>
-          <w:color w:val="1A1A1A"/>
-          <w:sz w:val="20"/>
-          <w:szCs w:val="20"/>
-        </w:rPr>
         <w:t>GPA: 4.0/4.0</w:t>
       </w:r>
     </w:p>
@@ -698,27 +713,7 @@
           <w:szCs w:val="20"/>
         </w:rPr>
         <w:tab/>
-        <w:t>July 2024</w:t>
-      </w:r>
-      <w:r>
-        <w:rPr>
-          <w:rFonts w:eastAsiaTheme="minorHAnsi"/>
-          <w:bCs/>
-          <w:color w:val="1A1A1A"/>
-          <w:sz w:val="20"/>
-          <w:szCs w:val="20"/>
-        </w:rPr>
-        <w:t xml:space="preserve"> – </w:t>
-      </w:r>
-      <w:r>
-        <w:rPr>
-          <w:rFonts w:eastAsiaTheme="minorHAnsi"/>
-          <w:bCs/>
-          <w:color w:val="1A1A1A"/>
-          <w:sz w:val="20"/>
-          <w:szCs w:val="20"/>
-        </w:rPr>
-        <w:t>August 2024</w:t>
+        <w:t>July 2024 – August 2024</w:t>
       </w:r>
     </w:p>
     <w:p>
@@ -753,47 +748,7 @@
           <w:sz w:val="20"/>
           <w:szCs w:val="20"/>
         </w:rPr>
-        <w:t xml:space="preserve">Developed Synthetic Aperture Radar (SAR) applications in collaboration with MIT Lincoln Labs </w:t>
-      </w:r>
-      <w:r>
-        <w:rPr>
-          <w:rFonts w:eastAsiaTheme="minorHAnsi"/>
-          <w:bCs/>
-          <w:color w:val="1A1A1A"/>
-          <w:sz w:val="20"/>
-          <w:szCs w:val="20"/>
-        </w:rPr>
-        <w:t xml:space="preserve">and the Department of Defense </w:t>
-      </w:r>
-      <w:r>
-        <w:rPr>
-          <w:rFonts w:eastAsiaTheme="minorHAnsi"/>
-          <w:bCs/>
-          <w:color w:val="1A1A1A"/>
-          <w:sz w:val="20"/>
-          <w:szCs w:val="20"/>
-        </w:rPr>
-        <w:t>to identify</w:t>
-      </w:r>
-      <w:r>
-        <w:rPr>
-          <w:rFonts w:eastAsiaTheme="minorHAnsi"/>
-          <w:bCs/>
-          <w:color w:val="1A1A1A"/>
-          <w:sz w:val="20"/>
-          <w:szCs w:val="20"/>
-        </w:rPr>
-        <w:t xml:space="preserve"> foreign</w:t>
-      </w:r>
-      <w:r>
-        <w:rPr>
-          <w:rFonts w:eastAsiaTheme="minorHAnsi"/>
-          <w:bCs/>
-          <w:color w:val="1A1A1A"/>
-          <w:sz w:val="20"/>
-          <w:szCs w:val="20"/>
-        </w:rPr>
-        <w:t xml:space="preserve"> objects through foliage</w:t>
+        <w:t>Developed Synthetic Aperture Radar (SAR) applications in collaboration with MIT Lincoln Labs and the Department of Defense to identify foreign objects through foliage</w:t>
       </w:r>
     </w:p>
     <w:p>
@@ -880,16 +835,7 @@
           <w:sz w:val="20"/>
           <w:szCs w:val="20"/>
         </w:rPr>
-        <w:t>Built</w:t>
-      </w:r>
-      <w:r>
-        <w:rPr>
-          <w:rFonts w:eastAsiaTheme="minorHAnsi"/>
-          <w:color w:val="1A1A1A"/>
-          <w:sz w:val="20"/>
-          <w:szCs w:val="20"/>
-        </w:rPr>
-        <w:t xml:space="preserve"> an F550 </w:t>
+        <w:t xml:space="preserve">Built an F550 </w:t>
       </w:r>
       <w:proofErr w:type="spellStart"/>
       <w:r>
@@ -934,7 +880,6 @@
     </w:p>
     <w:p>
       <w:pPr>
-        <w:pStyle w:val="ListParagraph"/>
         <w:widowControl w:val="0"/>
         <w:tabs>
           <w:tab w:val="right" w:pos="10800"/>
@@ -943,7 +888,6 @@
         <w:autoSpaceDN w:val="0"/>
         <w:adjustRightInd w:val="0"/>
         <w:spacing w:after="20"/>
-        <w:ind w:left="450"/>
         <w:rPr>
           <w:rFonts w:eastAsiaTheme="minorHAnsi"/>
           <w:bCs/>
@@ -952,6 +896,36 @@
           <w:szCs w:val="20"/>
         </w:rPr>
       </w:pPr>
+      <w:r>
+        <w:rPr>
+          <w:rFonts w:eastAsiaTheme="minorHAnsi"/>
+          <w:b/>
+          <w:color w:val="1A1A1A"/>
+          <w:sz w:val="20"/>
+          <w:szCs w:val="20"/>
+        </w:rPr>
+        <w:t>Idiopathic Pulmonary Fibrosis Research</w:t>
+      </w:r>
+      <w:r>
+        <w:rPr>
+          <w:rFonts w:eastAsiaTheme="minorHAnsi"/>
+          <w:b/>
+          <w:color w:val="1A1A1A"/>
+          <w:sz w:val="20"/>
+          <w:szCs w:val="20"/>
+        </w:rPr>
+        <w:tab/>
+      </w:r>
+      <w:r>
+        <w:rPr>
+          <w:rFonts w:eastAsiaTheme="minorHAnsi"/>
+          <w:bCs/>
+          <w:color w:val="1A1A1A"/>
+          <w:sz w:val="20"/>
+          <w:szCs w:val="20"/>
+        </w:rPr>
+        <w:t>Stanford University, CA</w:t>
+      </w:r>
     </w:p>
     <w:p>
       <w:pPr>
@@ -962,55 +936,6 @@
         <w:autoSpaceDE w:val="0"/>
         <w:autoSpaceDN w:val="0"/>
         <w:adjustRightInd w:val="0"/>
-        <w:spacing w:after="20"/>
-        <w:rPr>
-          <w:rFonts w:eastAsiaTheme="minorHAnsi"/>
-          <w:bCs/>
-          <w:color w:val="1A1A1A"/>
-          <w:sz w:val="20"/>
-          <w:szCs w:val="20"/>
-        </w:rPr>
-      </w:pPr>
-      <w:r>
-        <w:rPr>
-          <w:rFonts w:eastAsiaTheme="minorHAnsi"/>
-          <w:b/>
-          <w:color w:val="1A1A1A"/>
-          <w:sz w:val="20"/>
-          <w:szCs w:val="20"/>
-        </w:rPr>
-        <w:t>Idiopathic Pulmonary Fibrosis Research</w:t>
-      </w:r>
-      <w:r>
-        <w:rPr>
-          <w:rFonts w:eastAsiaTheme="minorHAnsi"/>
-          <w:b/>
-          <w:color w:val="1A1A1A"/>
-          <w:sz w:val="20"/>
-          <w:szCs w:val="20"/>
-        </w:rPr>
-        <w:tab/>
-      </w:r>
-      <w:r>
-        <w:rPr>
-          <w:rFonts w:eastAsiaTheme="minorHAnsi"/>
-          <w:bCs/>
-          <w:color w:val="1A1A1A"/>
-          <w:sz w:val="20"/>
-          <w:szCs w:val="20"/>
-        </w:rPr>
-        <w:t>Stanford University, CA</w:t>
-      </w:r>
-    </w:p>
-    <w:p>
-      <w:pPr>
-        <w:widowControl w:val="0"/>
-        <w:tabs>
-          <w:tab w:val="right" w:pos="10800"/>
-        </w:tabs>
-        <w:autoSpaceDE w:val="0"/>
-        <w:autoSpaceDN w:val="0"/>
-        <w:adjustRightInd w:val="0"/>
         <w:rPr>
           <w:rFonts w:eastAsiaTheme="minorHAnsi"/>
           <w:bCs/>
@@ -1042,27 +967,7 @@
           <w:szCs w:val="20"/>
         </w:rPr>
         <w:tab/>
-        <w:t>June 2023</w:t>
-      </w:r>
-      <w:r>
-        <w:rPr>
-          <w:rFonts w:eastAsiaTheme="minorHAnsi"/>
-          <w:bCs/>
-          <w:color w:val="1A1A1A"/>
-          <w:sz w:val="20"/>
-          <w:szCs w:val="20"/>
-        </w:rPr>
-        <w:t xml:space="preserve"> – </w:t>
-      </w:r>
-      <w:r>
-        <w:rPr>
-          <w:rFonts w:eastAsiaTheme="minorHAnsi"/>
-          <w:bCs/>
-          <w:color w:val="1A1A1A"/>
-          <w:sz w:val="20"/>
-          <w:szCs w:val="20"/>
-        </w:rPr>
-        <w:t>October 2023</w:t>
+        <w:t>June 2023 – October 2023</w:t>
       </w:r>
     </w:p>
     <w:p>
@@ -1128,16 +1033,7 @@
           <w:sz w:val="20"/>
           <w:szCs w:val="20"/>
         </w:rPr>
-        <w:t xml:space="preserve">Conducted wet lab experiments on human lung fibroblasts, focusing on </w:t>
-      </w:r>
-      <w:r>
-        <w:rPr>
-          <w:rFonts w:eastAsiaTheme="minorHAnsi"/>
-          <w:color w:val="1A1A1A"/>
-          <w:sz w:val="20"/>
-          <w:szCs w:val="20"/>
-        </w:rPr>
-        <w:t>Idiopathic Pulmonary Fibrosis and the effect of pirfenidone on serum-stimulated human lung fibroblasts</w:t>
+        <w:t>Conducted wet lab experiments on human lung fibroblasts, focusing on Idiopathic Pulmonary Fibrosis and the effect of pirfenidone on serum-stimulated human lung fibroblasts</w:t>
       </w:r>
     </w:p>
     <w:p>
@@ -1170,43 +1066,7 @@
           <w:sz w:val="20"/>
           <w:szCs w:val="20"/>
         </w:rPr>
-        <w:t xml:space="preserve">Gained hands-on experience in </w:t>
-      </w:r>
-      <w:r>
-        <w:rPr>
-          <w:rFonts w:eastAsiaTheme="minorHAnsi"/>
-          <w:color w:val="1A1A1A"/>
-          <w:sz w:val="20"/>
-          <w:szCs w:val="20"/>
-        </w:rPr>
-        <w:t>DNA/RNA isolation, PCR,</w:t>
-      </w:r>
-      <w:r>
-        <w:rPr>
-          <w:rFonts w:eastAsiaTheme="minorHAnsi"/>
-          <w:color w:val="1A1A1A"/>
-          <w:sz w:val="20"/>
-          <w:szCs w:val="20"/>
-        </w:rPr>
-        <w:t xml:space="preserve"> and</w:t>
-      </w:r>
-      <w:r>
-        <w:rPr>
-          <w:rFonts w:eastAsiaTheme="minorHAnsi"/>
-          <w:color w:val="1A1A1A"/>
-          <w:sz w:val="20"/>
-          <w:szCs w:val="20"/>
-        </w:rPr>
-        <w:t xml:space="preserve"> ELISA</w:t>
-      </w:r>
-      <w:r>
-        <w:rPr>
-          <w:rFonts w:eastAsiaTheme="minorHAnsi"/>
-          <w:color w:val="1A1A1A"/>
-          <w:sz w:val="20"/>
-          <w:szCs w:val="20"/>
-        </w:rPr>
-        <w:t xml:space="preserve">, developing a strong foundation in molecular biology </w:t>
+        <w:t xml:space="preserve">Gained hands-on experience in DNA/RNA isolation, PCR, and ELISA, developing a strong foundation in molecular biology </w:t>
       </w:r>
     </w:p>
     <w:p>
@@ -1244,7 +1104,6 @@
     </w:p>
     <w:p>
       <w:pPr>
-        <w:pStyle w:val="ListParagraph"/>
         <w:widowControl w:val="0"/>
         <w:tabs>
           <w:tab w:val="right" w:pos="10800"/>
@@ -1253,14 +1112,44 @@
         <w:autoSpaceDN w:val="0"/>
         <w:adjustRightInd w:val="0"/>
         <w:spacing w:after="20"/>
-        <w:ind w:left="450"/>
-        <w:rPr>
-          <w:rFonts w:eastAsiaTheme="minorHAnsi"/>
-          <w:color w:val="1A1A1A"/>
-          <w:sz w:val="20"/>
-          <w:szCs w:val="20"/>
-        </w:rPr>
-      </w:pPr>
+        <w:rPr>
+          <w:rFonts w:eastAsiaTheme="minorHAnsi"/>
+          <w:bCs/>
+          <w:color w:val="1A1A1A"/>
+          <w:sz w:val="20"/>
+          <w:szCs w:val="20"/>
+        </w:rPr>
+      </w:pPr>
+      <w:r>
+        <w:rPr>
+          <w:rFonts w:eastAsiaTheme="minorHAnsi"/>
+          <w:b/>
+          <w:color w:val="1A1A1A"/>
+          <w:sz w:val="20"/>
+          <w:szCs w:val="20"/>
+        </w:rPr>
+        <w:t xml:space="preserve">UC Berkeley Robot Open Autonomous Racing Program </w:t>
+      </w:r>
+      <w:r>
+        <w:rPr>
+          <w:rFonts w:eastAsiaTheme="minorHAnsi"/>
+          <w:b/>
+          <w:color w:val="1A1A1A"/>
+          <w:sz w:val="20"/>
+          <w:szCs w:val="20"/>
+        </w:rPr>
+        <w:tab/>
+      </w:r>
+      <w:r>
+        <w:rPr>
+          <w:rFonts w:eastAsiaTheme="minorHAnsi"/>
+          <w:bCs/>
+          <w:color w:val="1A1A1A"/>
+          <w:sz w:val="20"/>
+          <w:szCs w:val="20"/>
+        </w:rPr>
+        <w:t>Berkeley, CA</w:t>
+      </w:r>
     </w:p>
     <w:p>
       <w:pPr>
@@ -1271,55 +1160,6 @@
         <w:autoSpaceDE w:val="0"/>
         <w:autoSpaceDN w:val="0"/>
         <w:adjustRightInd w:val="0"/>
-        <w:spacing w:after="20"/>
-        <w:rPr>
-          <w:rFonts w:eastAsiaTheme="minorHAnsi"/>
-          <w:bCs/>
-          <w:color w:val="1A1A1A"/>
-          <w:sz w:val="20"/>
-          <w:szCs w:val="20"/>
-        </w:rPr>
-      </w:pPr>
-      <w:r>
-        <w:rPr>
-          <w:rFonts w:eastAsiaTheme="minorHAnsi"/>
-          <w:b/>
-          <w:color w:val="1A1A1A"/>
-          <w:sz w:val="20"/>
-          <w:szCs w:val="20"/>
-        </w:rPr>
-        <w:t xml:space="preserve">UC Berkeley Robot Open Autonomous Racing Program </w:t>
-      </w:r>
-      <w:r>
-        <w:rPr>
-          <w:rFonts w:eastAsiaTheme="minorHAnsi"/>
-          <w:b/>
-          <w:color w:val="1A1A1A"/>
-          <w:sz w:val="20"/>
-          <w:szCs w:val="20"/>
-        </w:rPr>
-        <w:tab/>
-      </w:r>
-      <w:r>
-        <w:rPr>
-          <w:rFonts w:eastAsiaTheme="minorHAnsi"/>
-          <w:bCs/>
-          <w:color w:val="1A1A1A"/>
-          <w:sz w:val="20"/>
-          <w:szCs w:val="20"/>
-        </w:rPr>
-        <w:t>Berkeley, CA</w:t>
-      </w:r>
-    </w:p>
-    <w:p>
-      <w:pPr>
-        <w:widowControl w:val="0"/>
-        <w:tabs>
-          <w:tab w:val="right" w:pos="10800"/>
-        </w:tabs>
-        <w:autoSpaceDE w:val="0"/>
-        <w:autoSpaceDN w:val="0"/>
-        <w:adjustRightInd w:val="0"/>
         <w:rPr>
           <w:rFonts w:eastAsiaTheme="minorHAnsi"/>
           <w:bCs/>
@@ -1360,17 +1200,7 @@
           <w:sz w:val="20"/>
           <w:szCs w:val="20"/>
         </w:rPr>
-        <w:t xml:space="preserve">July 2022 – </w:t>
-      </w:r>
-      <w:r>
-        <w:rPr>
-          <w:rFonts w:eastAsiaTheme="minorHAnsi"/>
-          <w:bCs/>
-          <w:color w:val="1A1A1A"/>
-          <w:sz w:val="20"/>
-          <w:szCs w:val="20"/>
-        </w:rPr>
-        <w:t>December 2022</w:t>
+        <w:t>July 2022 – December 2022</w:t>
       </w:r>
     </w:p>
     <w:p>
@@ -1501,29 +1331,7 @@
           <w:sz w:val="20"/>
           <w:szCs w:val="20"/>
         </w:rPr>
-        <w:t>LEADERSHIP AND</w:t>
-      </w:r>
-      <w:r>
-        <w:rPr>
-          <w:b/>
-          <w:spacing w:val="40"/>
-          <w:kern w:val="20"/>
-          <w:position w:val="2"/>
-          <w:sz w:val="20"/>
-          <w:szCs w:val="20"/>
-        </w:rPr>
-        <w:t xml:space="preserve"> </w:t>
-      </w:r>
-      <w:r>
-        <w:rPr>
-          <w:b/>
-          <w:spacing w:val="40"/>
-          <w:kern w:val="20"/>
-          <w:position w:val="2"/>
-          <w:sz w:val="20"/>
-          <w:szCs w:val="20"/>
-        </w:rPr>
-        <w:t>EXTRACURRICULARS</w:t>
+        <w:t>LEADERSHIP AND EXTRACURRICULARS</w:t>
       </w:r>
     </w:p>
     <w:p>
@@ -1761,7 +1569,6 @@
     </w:p>
     <w:p>
       <w:pPr>
-        <w:pStyle w:val="ListParagraph"/>
         <w:widowControl w:val="0"/>
         <w:tabs>
           <w:tab w:val="right" w:pos="10800"/>
@@ -1769,16 +1576,42 @@
         <w:autoSpaceDE w:val="0"/>
         <w:autoSpaceDN w:val="0"/>
         <w:adjustRightInd w:val="0"/>
-        <w:spacing w:after="20"/>
-        <w:ind w:left="450"/>
-        <w:rPr>
-          <w:rFonts w:eastAsiaTheme="minorHAnsi"/>
-          <w:bCs/>
-          <w:color w:val="1A1A1A"/>
-          <w:sz w:val="20"/>
-          <w:szCs w:val="20"/>
-        </w:rPr>
-      </w:pPr>
+        <w:rPr>
+          <w:rFonts w:eastAsiaTheme="minorHAnsi"/>
+          <w:color w:val="1A1A1A"/>
+          <w:sz w:val="20"/>
+          <w:szCs w:val="20"/>
+        </w:rPr>
+      </w:pPr>
+      <w:r>
+        <w:rPr>
+          <w:rFonts w:eastAsiaTheme="minorHAnsi"/>
+          <w:b/>
+          <w:color w:val="1A1A1A"/>
+          <w:sz w:val="20"/>
+          <w:szCs w:val="20"/>
+        </w:rPr>
+        <w:t>Leland High School Student Body President</w:t>
+      </w:r>
+      <w:r>
+        <w:rPr>
+          <w:rFonts w:eastAsiaTheme="minorHAnsi"/>
+          <w:b/>
+          <w:color w:val="1A1A1A"/>
+          <w:sz w:val="20"/>
+          <w:szCs w:val="20"/>
+        </w:rPr>
+        <w:tab/>
+      </w:r>
+      <w:r>
+        <w:rPr>
+          <w:rFonts w:eastAsiaTheme="minorHAnsi"/>
+          <w:color w:val="1A1A1A"/>
+          <w:sz w:val="20"/>
+          <w:szCs w:val="20"/>
+        </w:rPr>
+        <w:t>San Jose, CA</w:t>
+      </w:r>
     </w:p>
     <w:p>
       <w:pPr>
@@ -1799,27 +1632,17 @@
       <w:r>
         <w:rPr>
           <w:rFonts w:eastAsiaTheme="minorHAnsi"/>
-          <w:b/>
-          <w:color w:val="1A1A1A"/>
-          <w:sz w:val="20"/>
-          <w:szCs w:val="20"/>
-        </w:rPr>
-        <w:t>Leland High School Student Body</w:t>
-      </w:r>
-      <w:r>
-        <w:rPr>
-          <w:rFonts w:eastAsiaTheme="minorHAnsi"/>
-          <w:b/>
-          <w:color w:val="1A1A1A"/>
-          <w:sz w:val="20"/>
-          <w:szCs w:val="20"/>
-        </w:rPr>
-        <w:t xml:space="preserve"> President</w:t>
-      </w:r>
-      <w:r>
-        <w:rPr>
-          <w:rFonts w:eastAsiaTheme="minorHAnsi"/>
-          <w:b/>
+          <w:i/>
+          <w:color w:val="1A1A1A"/>
+          <w:sz w:val="20"/>
+          <w:szCs w:val="20"/>
+        </w:rPr>
+        <w:t>School President</w:t>
+      </w:r>
+      <w:r>
+        <w:rPr>
+          <w:rFonts w:eastAsiaTheme="minorHAnsi"/>
+          <w:i/>
           <w:color w:val="1A1A1A"/>
           <w:sz w:val="20"/>
           <w:szCs w:val="20"/>
@@ -1833,62 +1656,7 @@
           <w:sz w:val="20"/>
           <w:szCs w:val="20"/>
         </w:rPr>
-        <w:t>San Jose, CA</w:t>
-      </w:r>
-    </w:p>
-    <w:p>
-      <w:pPr>
-        <w:widowControl w:val="0"/>
-        <w:tabs>
-          <w:tab w:val="right" w:pos="10800"/>
-        </w:tabs>
-        <w:autoSpaceDE w:val="0"/>
-        <w:autoSpaceDN w:val="0"/>
-        <w:adjustRightInd w:val="0"/>
-        <w:rPr>
-          <w:rFonts w:eastAsiaTheme="minorHAnsi"/>
-          <w:color w:val="1A1A1A"/>
-          <w:sz w:val="20"/>
-          <w:szCs w:val="20"/>
-        </w:rPr>
-      </w:pPr>
-      <w:r>
-        <w:rPr>
-          <w:rFonts w:eastAsiaTheme="minorHAnsi"/>
-          <w:i/>
-          <w:color w:val="1A1A1A"/>
-          <w:sz w:val="20"/>
-          <w:szCs w:val="20"/>
-        </w:rPr>
-        <w:t>School President</w:t>
-      </w:r>
-      <w:r>
-        <w:rPr>
-          <w:rFonts w:eastAsiaTheme="minorHAnsi"/>
-          <w:i/>
-          <w:color w:val="1A1A1A"/>
-          <w:sz w:val="20"/>
-          <w:szCs w:val="20"/>
-        </w:rPr>
-        <w:tab/>
-      </w:r>
-      <w:r>
-        <w:rPr>
-          <w:rFonts w:eastAsiaTheme="minorHAnsi"/>
-          <w:color w:val="1A1A1A"/>
-          <w:sz w:val="20"/>
-          <w:szCs w:val="20"/>
-        </w:rPr>
-        <w:t xml:space="preserve">September 2021– </w:t>
-      </w:r>
-      <w:r>
-        <w:rPr>
-          <w:rFonts w:eastAsiaTheme="minorHAnsi"/>
-          <w:color w:val="1A1A1A"/>
-          <w:sz w:val="20"/>
-          <w:szCs w:val="20"/>
-        </w:rPr>
-        <w:t>May 2025</w:t>
+        <w:t>September 2021– May 2025</w:t>
       </w:r>
     </w:p>
     <w:p>
@@ -1954,34 +1722,7 @@
           <w:sz w:val="20"/>
           <w:szCs w:val="20"/>
         </w:rPr>
-        <w:t>Represent</w:t>
-      </w:r>
-      <w:r>
-        <w:rPr>
-          <w:rFonts w:eastAsiaTheme="minorHAnsi"/>
-          <w:color w:val="1A1A1A"/>
-          <w:sz w:val="20"/>
-          <w:szCs w:val="20"/>
-        </w:rPr>
-        <w:t>ed</w:t>
-      </w:r>
-      <w:r>
-        <w:rPr>
-          <w:rFonts w:eastAsiaTheme="minorHAnsi"/>
-          <w:color w:val="1A1A1A"/>
-          <w:sz w:val="20"/>
-          <w:szCs w:val="20"/>
-        </w:rPr>
-        <w:t xml:space="preserve"> the student </w:t>
-      </w:r>
-      <w:r>
-        <w:rPr>
-          <w:rFonts w:eastAsiaTheme="minorHAnsi"/>
-          <w:color w:val="1A1A1A"/>
-          <w:sz w:val="20"/>
-          <w:szCs w:val="20"/>
-        </w:rPr>
-        <w:t xml:space="preserve">body, working with district superintendents and school administration, attending school district meetings to voice concerns and enact policies </w:t>
+        <w:t xml:space="preserve">Represented the student body, working with district superintendents and school administration, attending school district meetings to voice concerns and enact policies </w:t>
       </w:r>
     </w:p>
     <w:p>
@@ -2046,14 +1787,7 @@
           <w:sz w:val="20"/>
           <w:szCs w:val="20"/>
         </w:rPr>
-        <w:t xml:space="preserve"> </w:t>
-      </w:r>
-      <w:r>
-        <w:rPr>
-          <w:sz w:val="20"/>
-          <w:szCs w:val="20"/>
-        </w:rPr>
-        <w:t>Python, Java, HTML, CSS, C++, C</w:t>
+        <w:t xml:space="preserve"> Python, Java, HTML, CSS, C++, C</w:t>
       </w:r>
     </w:p>
     <w:p>
@@ -2068,8 +1802,8 @@
         </w:tabs>
         <w:spacing w:after="40"/>
         <w:rPr>
-          <w:sz w:val="2"/>
-          <w:szCs w:val="2"/>
+          <w:sz w:val="20"/>
+          <w:szCs w:val="20"/>
         </w:rPr>
       </w:pPr>
       <w:r>
@@ -2079,30 +1813,14 @@
           <w:sz w:val="20"/>
           <w:szCs w:val="20"/>
         </w:rPr>
-        <w:t>Libraries and Tools</w:t>
-      </w:r>
-      <w:r>
-        <w:rPr>
-          <w:b/>
-          <w:bCs/>
-          <w:sz w:val="20"/>
-          <w:szCs w:val="20"/>
-        </w:rPr>
-        <w:t>:</w:t>
-      </w:r>
-      <w:r>
-        <w:rPr>
-          <w:sz w:val="20"/>
-          <w:szCs w:val="20"/>
-        </w:rPr>
-        <w:t xml:space="preserve"> </w:t>
-      </w:r>
-      <w:r>
-        <w:rPr>
-          <w:sz w:val="20"/>
-          <w:szCs w:val="20"/>
-        </w:rPr>
-        <w:t xml:space="preserve">NumPy, SciPy, </w:t>
+        <w:t>Libraries and Tools:</w:t>
+      </w:r>
+      <w:r>
+        <w:rPr>
+          <w:sz w:val="20"/>
+          <w:szCs w:val="20"/>
+        </w:rPr>
+        <w:t xml:space="preserve"> NumPy, SciPy, </w:t>
       </w:r>
       <w:proofErr w:type="spellStart"/>
       <w:r>
@@ -2120,23 +1838,6 @@
         </w:rPr>
         <w:t xml:space="preserve">, Gazebo, ROS  </w:t>
       </w:r>
-    </w:p>
-    <w:p>
-      <w:pPr>
-        <w:tabs>
-          <w:tab w:val="left" w:pos="-2025"/>
-          <w:tab w:val="left" w:pos="-1875"/>
-          <w:tab w:val="left" w:pos="0"/>
-          <w:tab w:val="left" w:pos="270"/>
-          <w:tab w:val="left" w:pos="2160"/>
-          <w:tab w:val="left" w:pos="10080"/>
-        </w:tabs>
-        <w:spacing w:after="40"/>
-        <w:rPr>
-          <w:sz w:val="20"/>
-          <w:szCs w:val="20"/>
-        </w:rPr>
-      </w:pPr>
     </w:p>
     <w:p>
       <w:pPr>

</xml_diff>